<commit_message>
Fixing issue with Lists cluster graph in version 3.x.x and  4.0.0 and 4.1.0
</commit_message>
<xml_diff>
--- a/ProfilesRNS_ReadMeFirst.docx
+++ b/ProfilesRNS_ReadMeFirst.docx
@@ -74,7 +74,13 @@
         <w:rPr>
           <w:rFonts w:cs="Arial"/>
         </w:rPr>
-        <w:t>October 1</w:t>
+        <w:t xml:space="preserve">October </w:t>
+      </w:r>
+      <w:r>
+        <w:rPr>
+          <w:rFonts w:cs="Arial"/>
+        </w:rPr>
+        <w:t>9</w:t>
       </w:r>
       <w:r>
         <w:rPr>
@@ -139,7 +145,13 @@
         <w:rPr>
           <w:rFonts w:cs="Arial"/>
         </w:rPr>
-        <w:t>.0</w:t>
+        <w:t>.</w:t>
+      </w:r>
+      <w:r>
+        <w:rPr>
+          <w:rFonts w:cs="Arial"/>
+        </w:rPr>
+        <w:t>1</w:t>
       </w:r>
     </w:p>
     <w:p>

</xml_diff>